<commit_message>
feat(activos): integracion de caracterizacion SE y CT Gemini SPARK con segmentacion Norma CADAFE NS-P-105
</commit_message>
<xml_diff>
--- a/apps/corpoelec-sigi-gestion-planificacion-distribucion/docs/NAC_2026_GGPD_AUDITORIA_ESTATUS_CUATRO_APLICACIONES_V01.docx
+++ b/apps/corpoelec-sigi-gestion-planificacion-distribucion/docs/NAC_2026_GGPD_AUDITORIA_ESTATUS_CUATRO_APLICACIONES_V01.docx
@@ -227,7 +227,7 @@
           <w:sz w:val="20"/>
           <w:szCs w:val="20"/>
         </w:rPr>
-        <w:t xml:space="preserve"> Yvan Ciprián | T.S.U. Josue Pacheco  </w:t>
+        <w:t xml:space="preserve"> Yvan Cipiran | T.S.U. Josue Pacheco  </w:t>
       </w:r>
     </w:p>
     <w:p>
@@ -4010,7 +4010,7 @@
           <w:sz w:val="20"/>
           <w:szCs w:val="20"/>
         </w:rPr>
-        <w:t xml:space="preserve">Yvan Ciprián</w:t>
+        <w:t xml:space="preserve">Yvan Cipiran</w:t>
       </w:r>
       <w:r>
         <w:rPr>

</xml_diff>